<commit_message>
rapor: grafiklerdeki gömülü başlıklar kaldırıldı (akademik şekil kuralı)
Şekil 1-5'te başlık iki yerde birden duruyordu: görselin içinde matplotlib
başlığı, altında Word altyazısı. Akademik yazımda görselin içinde başlık
bulunmaz; tanım yalnızca altyazıda (Şekil N.) verilir. Şekil 6-10 (ekran
görüntüleri) zaten bu kurala uygundu.

Yapılan: yalnızca üstteki başlık şeridi piksel olarak kırpıldı; grafikler
yeniden ÜRETİLMEDİ, veri ve panel başlıkları korundu.
- image2 (Şekil 1): 1500 -> 1385 px
- image3 (Şekil 2): 992 -> 862 px   (panel başlıkları duruyor)
- image4 (Şekil 3): 992 -> 900 px
- image5 (Şekil 4): 977 -> 881 px
- image6 (Şekil 5): 1088 -> 984 px
Word'deki wp:extent ve a:ext değerleri yeni en-boy oranına göre
güncellendi; görseller orantısız görünmüyor.

Sonuç: 19 -> 18 sayfa. Şema doğrulaması geçti.
</commit_message>
<xml_diff>
--- a/01-rapor/teslim/ITS_MIHENK_Teknik_Rapor_TESLIM.docx
+++ b/01-rapor/teslim/ITS_MIHENK_Teknik_Rapor_TESLIM.docx
@@ -3356,7 +3356,7 @@
         </w:rPr>
         <w:drawing>
           <wp:inline distT="0" distB="0" distL="0" distR="0" wp14:anchorId="613BD19A" wp14:editId="4EE4E38D">
-            <wp:extent cx="5486400" cy="3740727"/>
+            <wp:extent cx="5486400" cy="3453937"/>
             <wp:effectExtent l="0" t="0" r="0" b="0"/>
             <wp:docPr id="901" name="Sekil1"/>
             <wp:cNvGraphicFramePr>
@@ -3913,7 +3913,7 @@
         <w:lastRenderedPageBreak/>
         <w:drawing>
           <wp:inline distT="0" distB="0" distL="0" distR="0" wp14:anchorId="3DFA7390" wp14:editId="4C301EE6">
-            <wp:extent cx="5486400" cy="3169920"/>
+            <wp:extent cx="5486400" cy="2754507"/>
             <wp:effectExtent l="0" t="0" r="0" b="0"/>
             <wp:docPr id="902" name="Sekil2"/>
             <wp:cNvGraphicFramePr>
@@ -3935,7 +3935,7 @@
                   <pic:spPr>
                     <a:xfrm>
                       <a:off x="0" y="0"/>
-                      <a:ext cx="5486400" cy="3169920"/>
+                      <a:ext cx="5486400" cy="2875935"/>
                     </a:xfrm>
                     <a:prstGeom prst="rect">
                       <a:avLst/>
@@ -3976,7 +3976,7 @@
         </w:rPr>
         <w:drawing>
           <wp:inline distT="0" distB="0" distL="0" distR="0" wp14:anchorId="6D1E313F" wp14:editId="3A5439F8">
-            <wp:extent cx="5486400" cy="3048000"/>
+            <wp:extent cx="5486400" cy="2765322"/>
             <wp:effectExtent l="0" t="0" r="0" b="0"/>
             <wp:docPr id="903" name="Sekil3"/>
             <wp:cNvGraphicFramePr>
@@ -3998,7 +3998,7 @@
                   <pic:spPr>
                     <a:xfrm>
                       <a:off x="0" y="0"/>
-                      <a:ext cx="5486400" cy="3048000"/>
+                      <a:ext cx="5486400" cy="2748503"/>
                     </a:xfrm>
                     <a:prstGeom prst="rect">
                       <a:avLst/>
@@ -4043,7 +4043,7 @@
         <w:lastRenderedPageBreak/>
         <w:drawing>
           <wp:inline distT="0" distB="0" distL="0" distR="0" wp14:anchorId="4C40B124" wp14:editId="68D887F2">
-            <wp:extent cx="5486400" cy="2446469"/>
+            <wp:extent cx="5486400" cy="2206079"/>
             <wp:effectExtent l="0" t="0" r="0" b="0"/>
             <wp:docPr id="904" name="Sekil4"/>
             <wp:cNvGraphicFramePr>
@@ -4065,7 +4065,7 @@
                   <pic:spPr>
                     <a:xfrm>
                       <a:off x="0" y="0"/>
-                      <a:ext cx="5486400" cy="2446469"/>
+                      <a:ext cx="5486400" cy="2212615"/>
                     </a:xfrm>
                     <a:prstGeom prst="rect">
                       <a:avLst/>
@@ -4109,7 +4109,7 @@
         </w:rPr>
         <w:drawing>
           <wp:inline distT="0" distB="0" distL="0" distR="0" wp14:anchorId="55E42EE5" wp14:editId="2DE7FB2F">
-            <wp:extent cx="5486400" cy="3291840"/>
+            <wp:extent cx="5486400" cy="2977178"/>
             <wp:effectExtent l="0" t="0" r="0" b="0"/>
             <wp:docPr id="905" name="Sekil5"/>
             <wp:cNvGraphicFramePr>

</xml_diff>

<commit_message>
rapor: Tablo 1'e dayanak notu ve kaynak eklendi
Ekip içi geri bildirim: karşılaştırma tablosu rakip çözümler hakkında
iddia içeriyordu ama dayanağı gösterilmemişti. Rubrik 2.2 'somut piyasa
kıyaslarıyla gösterilmiş' diyor; dayanaksız iddia bu maddeyi karşılamaz
ve jüri 'neye göre?' diye sorabilir.

Eklenen:
- Tablo altına yöntem notu: sütunların tekil ürün değil ürün kategorisi
  olduğu, karşılaştırmanın kamuya açık dokümantasyon ve arayüz
  incelemesine dayandığı (Ağustos 2026), her kategori için referans
  alınan örnekler
- 'Gecikmesiz' satırı için ölçülmüş dayanak: Community Notes üzerine
  yapılan çalışmada notların ortalama 65,7 saat sonra yayımlandığı
  bulgusu [8]
- Kaynakça: [8] arXiv:2510.12559

Uydurma atıf eklenmedi; yalnızca doğrulanabilen bir bulgu kaynak
gösterildi, kalan karşılaştırma açıkça takım değerlendirmesi olarak
nitelendi.
</commit_message>
<xml_diff>
--- a/01-rapor/teslim/ITS_MIHENK_Teknik_Rapor_TESLIM.docx
+++ b/01-rapor/teslim/ITS_MIHENK_Teknik_Rapor_TESLIM.docx
@@ -2944,6 +2944,18 @@
     </w:p>
     <w:p>
       <w:pPr>
+        <w:spacing w:after="160" w:line="240" w:lineRule="auto"/>
+        <w:jc w:val="both"/>
+      </w:pPr>
+      <w:r>
+        <w:rPr>
+          <w:sz w:val="18"/>
+        </w:rPr>
+        <w:t xml:space="preserve">Tablonun dayanağı: Sütunlar tekil ürünleri değil ürün kategorilerini temsil eder; karşılaştırma, kategorilerin kamuya açık ürün dokümantasyonu ve arayüz incelemesine dayanan takım değerlendirmesidir (Ağustos 2026). Referans alınan örnekler: platform içi YZ özeti için akış içi özet sunan sosyal platform özellikleri; haber kaynağı karşılaştırma için aynı olayı farklı yayın çizgilerinde gösteren haber toplayıcıları; topluluk temelli doğrulama için X Community Notes; genel amaçlı YZ asistanı için sohbet arayüzlü büyük dil modeli ürünleri. "Gecikmesiz" satırı ölçülmüş bir bulguya dayanır: Community Notes üzerine yapılan bir çalışmada notların gönderiden ortalama 65,7 saat sonra yayımlandığı raporlanmıştır [8].</w:t>
+      </w:r>
+    </w:p>
+    <w:p>
+      <w:pPr>
         <w:spacing w:after="180"/>
         <w:jc w:val="both"/>
       </w:pPr>
@@ -6833,6 +6845,15 @@
       </w:pPr>
       <w:r>
         <w:t xml:space="preserve">[7] Anadolu Ajansı, NSosyal'in kullanıcı sayısı 1,7 milyonu aştı, 2025, Erişim: 24.08.2026, https://www.aa.com.tr/tr/bilim-teknoloji/nsosyalin-kullanici-sayisi-1-7-milyonu-asti/3784864</w:t>
+      </w:r>
+    </w:p>
+    <w:p>
+      <w:pPr>
+        <w:spacing w:after="180" w:line="276" w:lineRule="auto"/>
+        <w:jc w:val="both"/>
+      </w:pPr>
+      <w:r>
+        <w:t xml:space="preserve">[8] Timeliness, Consensus, and Composition of the Crowd: Community Notes on X, arXiv:2510.12559, 2025, Erişim: 24.08.2026, https://arxiv.org/abs/2510.12559</w:t>
       </w:r>
     </w:p>
     <w:p>

</xml_diff>